<commit_message>
Migra placeholder de documento en las firmas de las plantillas a número de documento
</commit_message>
<xml_diff>
--- a/plantillas/plantilla_contrato_mutuo.docx
+++ b/plantillas/plantilla_contrato_mutuo.docx
@@ -4,7 +4,7 @@
   <w:body>
     <w:p>
       <w:pPr>
-        <w:pStyle w:val="Normal1"/>
+        <w:pStyle w:val="LOnormal"/>
         <w:rPr/>
       </w:pPr>
       <w:r>
@@ -58,7 +58,7 @@
     </w:p>
     <w:p>
       <w:pPr>
-        <w:pStyle w:val="Normal1"/>
+        <w:pStyle w:val="LOnormal"/>
         <w:jc w:val="center"/>
         <w:rPr/>
       </w:pPr>
@@ -69,7 +69,7 @@
     </w:p>
     <w:p>
       <w:pPr>
-        <w:pStyle w:val="Normal1"/>
+        <w:pStyle w:val="LOnormal"/>
         <w:spacing w:lineRule="auto" w:line="276"/>
         <w:rPr/>
       </w:pPr>
@@ -138,7 +138,7 @@
     </w:p>
     <w:p>
       <w:pPr>
-        <w:pStyle w:val="Normal1"/>
+        <w:pStyle w:val="LOnormal"/>
         <w:spacing w:lineRule="auto" w:line="276"/>
         <w:rPr>
           <w:b/>
@@ -213,7 +213,7 @@
     </w:p>
     <w:p>
       <w:pPr>
-        <w:pStyle w:val="Normal1"/>
+        <w:pStyle w:val="LOnormal"/>
         <w:spacing w:lineRule="auto" w:line="276"/>
         <w:rPr/>
       </w:pPr>
@@ -228,7 +228,7 @@
     </w:p>
     <w:p>
       <w:pPr>
-        <w:pStyle w:val="Normal1"/>
+        <w:pStyle w:val="LOnormal"/>
         <w:spacing w:lineRule="auto" w:line="276"/>
         <w:rPr/>
       </w:pPr>
@@ -241,7 +241,7 @@
     </w:p>
     <w:p>
       <w:pPr>
-        <w:pStyle w:val="Normal1"/>
+        <w:pStyle w:val="LOnormal"/>
         <w:spacing w:lineRule="auto" w:line="276"/>
         <w:rPr/>
       </w:pPr>
@@ -260,7 +260,7 @@
     </w:p>
     <w:p>
       <w:pPr>
-        <w:pStyle w:val="Normal1"/>
+        <w:pStyle w:val="LOnormal"/>
         <w:spacing w:lineRule="auto" w:line="276"/>
         <w:rPr/>
       </w:pPr>
@@ -271,7 +271,7 @@
     </w:p>
     <w:p>
       <w:pPr>
-        <w:pStyle w:val="Normal1"/>
+        <w:pStyle w:val="LOnormal"/>
         <w:spacing w:lineRule="auto" w:line="276"/>
         <w:rPr/>
       </w:pPr>
@@ -303,7 +303,7 @@
     </w:p>
     <w:p>
       <w:pPr>
-        <w:pStyle w:val="Normal1"/>
+        <w:pStyle w:val="LOnormal"/>
         <w:spacing w:lineRule="auto" w:line="276"/>
         <w:rPr/>
       </w:pPr>
@@ -362,7 +362,7 @@
     </w:p>
     <w:p>
       <w:pPr>
-        <w:pStyle w:val="Normal1"/>
+        <w:pStyle w:val="LOnormal"/>
         <w:spacing w:lineRule="auto" w:line="276"/>
         <w:rPr/>
       </w:pPr>
@@ -407,7 +407,7 @@
     </w:p>
     <w:p>
       <w:pPr>
-        <w:pStyle w:val="Normal1"/>
+        <w:pStyle w:val="LOnormal"/>
         <w:rPr/>
       </w:pPr>
       <w:r>
@@ -429,7 +429,7 @@
     </w:p>
     <w:p>
       <w:pPr>
-        <w:pStyle w:val="Normal1"/>
+        <w:pStyle w:val="LOnormal"/>
         <w:spacing w:lineRule="auto" w:line="240"/>
         <w:jc w:val="center"/>
         <w:rPr/>
@@ -440,7 +440,7 @@
     </w:p>
     <w:p>
       <w:pPr>
-        <w:pStyle w:val="Normal1"/>
+        <w:pStyle w:val="LOnormal"/>
         <w:spacing w:lineRule="auto" w:line="240"/>
         <w:jc w:val="center"/>
         <w:rPr/>
@@ -458,17 +458,17 @@
     </w:p>
     <w:p>
       <w:pPr>
-        <w:pStyle w:val="Normal1"/>
-        <w:jc w:val="center"/>
-        <w:rPr/>
-      </w:pPr>
-      <w:r>
-        <w:rPr/>
-      </w:r>
-    </w:p>
-    <w:p>
-      <w:pPr>
-        <w:pStyle w:val="Normal1"/>
+        <w:pStyle w:val="LOnormal"/>
+        <w:jc w:val="center"/>
+        <w:rPr/>
+      </w:pPr>
+      <w:r>
+        <w:rPr/>
+      </w:r>
+    </w:p>
+    <w:p>
+      <w:pPr>
+        <w:pStyle w:val="LOnormal"/>
         <w:jc w:val="center"/>
         <w:rPr/>
       </w:pPr>
@@ -481,25 +481,25 @@
     </w:p>
     <w:p>
       <w:pPr>
-        <w:pStyle w:val="Normal1"/>
-        <w:jc w:val="center"/>
-        <w:rPr/>
-      </w:pPr>
-      <w:r>
-        <w:rPr/>
-      </w:r>
-    </w:p>
-    <w:p>
-      <w:pPr>
-        <w:pStyle w:val="Normal1"/>
-        <w:jc w:val="center"/>
-        <w:rPr/>
-      </w:pPr>
-      <w:r>
-        <w:rPr>
-          <w:b/>
-        </w:rPr>
-        <w:t>{{cliente_dni}}</w:t>
+        <w:pStyle w:val="LOnormal"/>
+        <w:jc w:val="center"/>
+        <w:rPr/>
+      </w:pPr>
+      <w:r>
+        <w:rPr/>
+      </w:r>
+    </w:p>
+    <w:p>
+      <w:pPr>
+        <w:pStyle w:val="LOnormal"/>
+        <w:jc w:val="center"/>
+        <w:rPr/>
+      </w:pPr>
+      <w:r>
+        <w:rPr>
+          <w:b/>
+        </w:rPr>
+        <w:t>{{cliente_nro_doc}}</w:t>
         <w:br/>
       </w:r>
       <w:r>
@@ -509,7 +509,7 @@
     </w:p>
     <w:p>
       <w:pPr>
-        <w:pStyle w:val="Normal1"/>
+        <w:pStyle w:val="LOnormal"/>
         <w:jc w:val="center"/>
         <w:rPr/>
       </w:pPr>
@@ -522,7 +522,7 @@
     </w:p>
     <w:p>
       <w:pPr>
-        <w:pStyle w:val="Normal1"/>
+        <w:pStyle w:val="LOnormal"/>
         <w:jc w:val="center"/>
         <w:rPr/>
       </w:pPr>
@@ -539,17 +539,17 @@
     </w:p>
     <w:p>
       <w:pPr>
-        <w:pStyle w:val="Normal1"/>
-        <w:jc w:val="center"/>
-        <w:rPr/>
-      </w:pPr>
-      <w:r>
-        <w:rPr/>
-      </w:r>
-    </w:p>
-    <w:p>
-      <w:pPr>
-        <w:pStyle w:val="Normal1"/>
+        <w:pStyle w:val="LOnormal"/>
+        <w:jc w:val="center"/>
+        <w:rPr/>
+      </w:pPr>
+      <w:r>
+        <w:rPr/>
+      </w:r>
+    </w:p>
+    <w:p>
+      <w:pPr>
+        <w:pStyle w:val="LOnormal"/>
         <w:jc w:val="center"/>
         <w:rPr/>
       </w:pPr>
@@ -562,17 +562,17 @@
     </w:p>
     <w:p>
       <w:pPr>
-        <w:pStyle w:val="Normal1"/>
-        <w:jc w:val="center"/>
-        <w:rPr/>
-      </w:pPr>
-      <w:r>
-        <w:rPr/>
-      </w:r>
-    </w:p>
-    <w:p>
-      <w:pPr>
-        <w:pStyle w:val="Normal1"/>
+        <w:pStyle w:val="LOnormal"/>
+        <w:jc w:val="center"/>
+        <w:rPr/>
+      </w:pPr>
+      <w:r>
+        <w:rPr/>
+      </w:r>
+    </w:p>
+    <w:p>
+      <w:pPr>
+        <w:pStyle w:val="LOnormal"/>
         <w:spacing w:before="0" w:after="200"/>
         <w:jc w:val="center"/>
         <w:rPr>
@@ -584,7 +584,7 @@
         <w:rPr>
           <w:b/>
         </w:rPr>
-        <w:t>{{garante_dni}}</w:t>
+        <w:t>{{garante_nro_doc}}</w:t>
         <w:br/>
       </w:r>
       <w:r>
@@ -627,6 +627,7 @@
     <w:qFormat/>
     <w:pPr>
       <w:widowControl/>
+      <w:suppressAutoHyphens w:val="true"/>
       <w:bidi w:val="0"/>
       <w:spacing w:lineRule="auto" w:line="276" w:before="0" w:after="200"/>
       <w:jc w:val="left"/>
@@ -642,8 +643,8 @@
   </w:style>
   <w:style w:type="paragraph" w:styleId="Ttulo1">
     <w:name w:val="Heading 1"/>
-    <w:basedOn w:val="Normal1"/>
-    <w:next w:val="Normal1"/>
+    <w:basedOn w:val="LOnormal"/>
+    <w:next w:val="LOnormal"/>
     <w:qFormat/>
     <w:pPr>
       <w:keepNext w:val="true"/>
@@ -660,8 +661,8 @@
   </w:style>
   <w:style w:type="paragraph" w:styleId="Ttulo2">
     <w:name w:val="Heading 2"/>
-    <w:basedOn w:val="Normal1"/>
-    <w:next w:val="Normal1"/>
+    <w:basedOn w:val="LOnormal"/>
+    <w:next w:val="LOnormal"/>
     <w:qFormat/>
     <w:pPr>
       <w:keepNext w:val="true"/>
@@ -678,8 +679,8 @@
   </w:style>
   <w:style w:type="paragraph" w:styleId="Ttulo3">
     <w:name w:val="Heading 3"/>
-    <w:basedOn w:val="Normal1"/>
-    <w:next w:val="Normal1"/>
+    <w:basedOn w:val="LOnormal"/>
+    <w:next w:val="LOnormal"/>
     <w:qFormat/>
     <w:pPr>
       <w:keepNext w:val="true"/>
@@ -694,8 +695,8 @@
   </w:style>
   <w:style w:type="paragraph" w:styleId="Ttulo4">
     <w:name w:val="Heading 4"/>
-    <w:basedOn w:val="Normal1"/>
-    <w:next w:val="Normal1"/>
+    <w:basedOn w:val="LOnormal"/>
+    <w:next w:val="LOnormal"/>
     <w:qFormat/>
     <w:pPr>
       <w:keepNext w:val="true"/>
@@ -711,8 +712,8 @@
   </w:style>
   <w:style w:type="paragraph" w:styleId="Ttulo5">
     <w:name w:val="Heading 5"/>
-    <w:basedOn w:val="Normal1"/>
-    <w:next w:val="Normal1"/>
+    <w:basedOn w:val="LOnormal"/>
+    <w:next w:val="LOnormal"/>
     <w:qFormat/>
     <w:pPr>
       <w:keepNext w:val="true"/>
@@ -726,8 +727,8 @@
   </w:style>
   <w:style w:type="paragraph" w:styleId="Ttulo6">
     <w:name w:val="Heading 6"/>
-    <w:basedOn w:val="Normal1"/>
-    <w:next w:val="Normal1"/>
+    <w:basedOn w:val="LOnormal"/>
+    <w:next w:val="LOnormal"/>
     <w:qFormat/>
     <w:pPr>
       <w:keepNext w:val="true"/>
@@ -798,11 +799,12 @@
       <w:rFonts w:cs="Lohit Devanagari"/>
     </w:rPr>
   </w:style>
-  <w:style w:type="paragraph" w:styleId="Normal1" w:default="1">
+  <w:style w:type="paragraph" w:styleId="LOnormal" w:default="1">
     <w:name w:val="LO-normal"/>
     <w:qFormat/>
     <w:pPr>
       <w:widowControl/>
+      <w:suppressAutoHyphens w:val="true"/>
       <w:bidi w:val="0"/>
       <w:spacing w:lineRule="auto" w:line="276" w:before="0" w:after="200"/>
       <w:jc w:val="left"/>
@@ -818,8 +820,8 @@
   </w:style>
   <w:style w:type="paragraph" w:styleId="Ttulogeneral">
     <w:name w:val="Title"/>
-    <w:basedOn w:val="Normal1"/>
-    <w:next w:val="Normal1"/>
+    <w:basedOn w:val="LOnormal"/>
+    <w:next w:val="LOnormal"/>
     <w:qFormat/>
     <w:pPr>
       <w:pBdr>
@@ -836,8 +838,8 @@
   </w:style>
   <w:style w:type="paragraph" w:styleId="Subttulo">
     <w:name w:val="Subtitle"/>
-    <w:basedOn w:val="Normal1"/>
-    <w:next w:val="Normal1"/>
+    <w:basedOn w:val="LOnormal"/>
+    <w:next w:val="LOnormal"/>
     <w:qFormat/>
     <w:pPr/>
     <w:rPr>

</xml_diff>

<commit_message>
Muestra el tipo real de documento en las firmas de las plantillas en lugar de la etiqueta fija
</commit_message>
<xml_diff>
--- a/plantillas/plantilla_contrato_mutuo.docx
+++ b/plantillas/plantilla_contrato_mutuo.docx
@@ -501,10 +501,7 @@
         </w:rPr>
         <w:t>{{cliente_nro_doc}}</w:t>
         <w:br/>
-      </w:r>
-      <w:r>
-        <w:rPr/>
-        <w:t>DNI-CUIT-CUIL</w:t>
+        <w:t>{{cliente_tipo_doc}}</w:t>
       </w:r>
     </w:p>
     <w:p>
@@ -586,10 +583,7 @@
         </w:rPr>
         <w:t>{{garante_nro_doc}}</w:t>
         <w:br/>
-      </w:r>
-      <w:r>
-        <w:rPr/>
-        <w:t>DNI-CUIT-CUIL</w:t>
+        <w:t>{{garante_tipo_doc}}</w:t>
       </w:r>
     </w:p>
     <w:sectPr>

</xml_diff>

<commit_message>
Agrega tabla de vencimientos al contrato y helper multiplataforma para abrir archivos
</commit_message>
<xml_diff>
--- a/plantillas/plantilla_contrato_mutuo.docx
+++ b/plantillas/plantilla_contrato_mutuo.docx
@@ -1,16 +1,18 @@
 
 <file path=word/document.xml><?xml version="1.0" encoding="utf-8"?>
-<w:document xmlns:o="urn:schemas-microsoft-com:office:office" xmlns:r="http://schemas.openxmlformats.org/officeDocument/2006/relationships" xmlns:v="urn:schemas-microsoft-com:vml" xmlns:w="http://schemas.openxmlformats.org/wordprocessingml/2006/main" xmlns:w10="urn:schemas-microsoft-com:office:word" xmlns:wp="http://schemas.openxmlformats.org/drawingml/2006/wordprocessingDrawing" xmlns:wps="http://schemas.microsoft.com/office/word/2010/wordprocessingShape" xmlns:wpg="http://schemas.microsoft.com/office/word/2010/wordprocessingGroup" xmlns:mc="http://schemas.openxmlformats.org/markup-compatibility/2006" xmlns:wp14="http://schemas.microsoft.com/office/word/2010/wordprocessingDrawing" xmlns:w14="http://schemas.microsoft.com/office/word/2010/wordml" xmlns:w15="http://schemas.microsoft.com/office/word/2012/wordml" mc:Ignorable="w14 wp14 w15">
+<w:document xmlns:o="urn:schemas-microsoft-com:office:office" xmlns:r="http://schemas.openxmlformats.org/officeDocument/2006/relationships" xmlns:v="urn:schemas-microsoft-com:vml" xmlns:w="http://schemas.openxmlformats.org/wordprocessingml/2006/main" xmlns:w10="urn:schemas-microsoft-com:office:word" xmlns:wp="http://schemas.openxmlformats.org/drawingml/2006/wordprocessingDrawing" xmlns:pic="http://schemas.openxmlformats.org/drawingml/2006/picture" xmlns:wps="http://schemas.microsoft.com/office/word/2010/wordprocessingShape" xmlns:wpg="http://schemas.microsoft.com/office/word/2010/wordprocessingGroup" xmlns:mc="http://schemas.openxmlformats.org/markup-compatibility/2006" xmlns:wp14="http://schemas.microsoft.com/office/word/2010/wordprocessingDrawing" xmlns:w14="http://schemas.microsoft.com/office/word/2010/wordml" xmlns:w15="http://schemas.microsoft.com/office/word/2012/wordml" mc:Ignorable="w14 wp14 w15">
   <w:body>
     <w:p>
       <w:pPr>
-        <w:pStyle w:val="LOnormal"/>
+        <w:pStyle w:val="LO-normal"/>
+        <w:bidi w:val="0"/>
+        <w:jc w:val="start"/>
         <w:rPr/>
       </w:pPr>
       <w:r>
         <w:rPr/>
         <w:drawing>
-          <wp:anchor behindDoc="0" distT="0" distB="0" distL="0" distR="0" simplePos="0" locked="0" layoutInCell="0" allowOverlap="1" relativeHeight="2">
+          <wp:anchor distT="0" distB="0" distL="0" distR="0" simplePos="0" relativeHeight="2" behindDoc="0" locked="0" layoutInCell="0" allowOverlap="1">
             <wp:simplePos x="0" y="0"/>
             <wp:positionH relativeFrom="column">
               <wp:posOffset>0</wp:posOffset>
@@ -21,7 +23,7 @@
             <wp:extent cx="6296025" cy="512445"/>
             <wp:effectExtent l="0" t="0" r="0" b="0"/>
             <wp:wrapSquare wrapText="bothSides"/>
-            <wp:docPr id="1" name="image1.png" descr=""/>
+            <wp:docPr id="1" name="image1.png"/>
             <wp:cNvGraphicFramePr>
               <a:graphicFrameLocks xmlns:a="http://schemas.openxmlformats.org/drawingml/2006/main" noChangeAspect="1"/>
             </wp:cNvGraphicFramePr>
@@ -29,7 +31,7 @@
               <a:graphicData uri="http://schemas.openxmlformats.org/drawingml/2006/picture">
                 <pic:pic xmlns:pic="http://schemas.openxmlformats.org/drawingml/2006/picture">
                   <pic:nvPicPr>
-                    <pic:cNvPr id="1" name="image1.png" descr=""/>
+                    <pic:cNvPr id="1" name="image1.png"/>
                     <pic:cNvPicPr>
                       <a:picLocks noChangeAspect="1" noChangeArrowheads="1"/>
                     </pic:cNvPicPr>
@@ -48,6 +50,7 @@
                     <a:prstGeom prst="rect">
                       <a:avLst/>
                     </a:prstGeom>
+                    <a:noFill/>
                   </pic:spPr>
                 </pic:pic>
               </a:graphicData>
@@ -58,7 +61,7 @@
     </w:p>
     <w:p>
       <w:pPr>
-        <w:pStyle w:val="LOnormal"/>
+        <w:pStyle w:val="LO-normal"/>
         <w:jc w:val="center"/>
         <w:rPr/>
       </w:pPr>
@@ -69,7 +72,7 @@
     </w:p>
     <w:p>
       <w:pPr>
-        <w:pStyle w:val="LOnormal"/>
+        <w:pStyle w:val="LO-normal"/>
         <w:spacing w:lineRule="auto" w:line="276"/>
         <w:rPr/>
       </w:pPr>
@@ -138,11 +141,10 @@
     </w:p>
     <w:p>
       <w:pPr>
-        <w:pStyle w:val="LOnormal"/>
+        <w:pStyle w:val="LO-normal"/>
         <w:spacing w:lineRule="auto" w:line="276"/>
         <w:rPr>
           <w:b/>
-          <w:b/>
         </w:rPr>
       </w:pPr>
       <w:r>
@@ -158,7 +160,7 @@
       </w:r>
       <w:r>
         <w:rPr/>
-        <w:t xml:space="preserve">,  </w:t>
+        <w:t xml:space="preserve">, </w:t>
         <w:br/>
         <w:t xml:space="preserve">cancelables en </w:t>
       </w:r>
@@ -190,7 +192,7 @@
       </w:r>
       <w:r>
         <w:rPr/>
-        <w:t>.</w:t>
+        <w:t xml:space="preserve">. </w:t>
       </w:r>
       <w:r>
         <w:rPr>
@@ -207,13 +209,41 @@
           <w:b/>
         </w:rPr>
         <w:t>({{ptf_letras}})</w:t>
-        <w:br/>
+      </w:r>
+    </w:p>
+    <w:p>
+      <w:pPr>
+        <w:pStyle w:val="LO-normal"/>
+        <w:spacing w:lineRule="auto" w:line="276"/>
+        <w:rPr>
+          <w:b/>
+        </w:rPr>
+      </w:pPr>
+      <w:r>
+        <w:rPr>
+          <w:b/>
+        </w:rPr>
+        <w:t>Cronograma de vencimientos:</w:t>
+      </w:r>
+    </w:p>
+    <w:p>
+      <w:pPr>
+        <w:pStyle w:val="LO-normal"/>
+        <w:spacing w:lineRule="auto" w:line="276"/>
+        <w:rPr>
+          <w:b/>
+        </w:rPr>
+      </w:pPr>
+      <w:r>
+        <w:rPr>
+          <w:b/>
+        </w:rPr>
         <w:t>{{vencimientos}}</w:t>
       </w:r>
     </w:p>
     <w:p>
       <w:pPr>
-        <w:pStyle w:val="LOnormal"/>
+        <w:pStyle w:val="LO-normal"/>
         <w:spacing w:lineRule="auto" w:line="276"/>
         <w:rPr/>
       </w:pPr>
@@ -228,7 +258,7 @@
     </w:p>
     <w:p>
       <w:pPr>
-        <w:pStyle w:val="LOnormal"/>
+        <w:pStyle w:val="LO-normal"/>
         <w:spacing w:lineRule="auto" w:line="276"/>
         <w:rPr/>
       </w:pPr>
@@ -241,7 +271,7 @@
     </w:p>
     <w:p>
       <w:pPr>
-        <w:pStyle w:val="LOnormal"/>
+        <w:pStyle w:val="LO-normal"/>
         <w:spacing w:lineRule="auto" w:line="276"/>
         <w:rPr/>
       </w:pPr>
@@ -260,7 +290,7 @@
     </w:p>
     <w:p>
       <w:pPr>
-        <w:pStyle w:val="LOnormal"/>
+        <w:pStyle w:val="LO-normal"/>
         <w:spacing w:lineRule="auto" w:line="276"/>
         <w:rPr/>
       </w:pPr>
@@ -271,7 +301,7 @@
     </w:p>
     <w:p>
       <w:pPr>
-        <w:pStyle w:val="LOnormal"/>
+        <w:pStyle w:val="LO-normal"/>
         <w:spacing w:lineRule="auto" w:line="276"/>
         <w:rPr/>
       </w:pPr>
@@ -303,7 +333,7 @@
     </w:p>
     <w:p>
       <w:pPr>
-        <w:pStyle w:val="LOnormal"/>
+        <w:pStyle w:val="LO-normal"/>
         <w:spacing w:lineRule="auto" w:line="276"/>
         <w:rPr/>
       </w:pPr>
@@ -362,7 +392,7 @@
     </w:p>
     <w:p>
       <w:pPr>
-        <w:pStyle w:val="LOnormal"/>
+        <w:pStyle w:val="LO-normal"/>
         <w:spacing w:lineRule="auto" w:line="276"/>
         <w:rPr/>
       </w:pPr>
@@ -407,7 +437,7 @@
     </w:p>
     <w:p>
       <w:pPr>
-        <w:pStyle w:val="LOnormal"/>
+        <w:pStyle w:val="LO-normal"/>
         <w:rPr/>
       </w:pPr>
       <w:r>
@@ -429,7 +459,7 @@
     </w:p>
     <w:p>
       <w:pPr>
-        <w:pStyle w:val="LOnormal"/>
+        <w:pStyle w:val="LO-normal"/>
         <w:spacing w:lineRule="auto" w:line="240"/>
         <w:jc w:val="center"/>
         <w:rPr/>
@@ -440,7 +470,7 @@
     </w:p>
     <w:p>
       <w:pPr>
-        <w:pStyle w:val="LOnormal"/>
+        <w:pStyle w:val="LO-normal"/>
         <w:spacing w:lineRule="auto" w:line="240"/>
         <w:jc w:val="center"/>
         <w:rPr/>
@@ -458,17 +488,17 @@
     </w:p>
     <w:p>
       <w:pPr>
-        <w:pStyle w:val="LOnormal"/>
-        <w:jc w:val="center"/>
-        <w:rPr/>
-      </w:pPr>
-      <w:r>
-        <w:rPr/>
-      </w:r>
-    </w:p>
-    <w:p>
-      <w:pPr>
-        <w:pStyle w:val="LOnormal"/>
+        <w:pStyle w:val="LO-normal"/>
+        <w:jc w:val="center"/>
+        <w:rPr/>
+      </w:pPr>
+      <w:r>
+        <w:rPr/>
+      </w:r>
+    </w:p>
+    <w:p>
+      <w:pPr>
+        <w:pStyle w:val="LO-normal"/>
         <w:jc w:val="center"/>
         <w:rPr/>
       </w:pPr>
@@ -481,17 +511,17 @@
     </w:p>
     <w:p>
       <w:pPr>
-        <w:pStyle w:val="LOnormal"/>
-        <w:jc w:val="center"/>
-        <w:rPr/>
-      </w:pPr>
-      <w:r>
-        <w:rPr/>
-      </w:r>
-    </w:p>
-    <w:p>
-      <w:pPr>
-        <w:pStyle w:val="LOnormal"/>
+        <w:pStyle w:val="LO-normal"/>
+        <w:jc w:val="center"/>
+        <w:rPr/>
+      </w:pPr>
+      <w:r>
+        <w:rPr/>
+      </w:r>
+    </w:p>
+    <w:p>
+      <w:pPr>
+        <w:pStyle w:val="LO-normal"/>
         <w:jc w:val="center"/>
         <w:rPr/>
       </w:pPr>
@@ -506,7 +536,8 @@
     </w:p>
     <w:p>
       <w:pPr>
-        <w:pStyle w:val="LOnormal"/>
+        <w:pStyle w:val="LO-normal"/>
+        <w:spacing w:before="0" w:after="200"/>
         <w:jc w:val="center"/>
         <w:rPr/>
       </w:pPr>
@@ -519,7 +550,7 @@
     </w:p>
     <w:p>
       <w:pPr>
-        <w:pStyle w:val="LOnormal"/>
+        <w:pStyle w:val="LO-normal"/>
         <w:jc w:val="center"/>
         <w:rPr/>
       </w:pPr>
@@ -536,17 +567,17 @@
     </w:p>
     <w:p>
       <w:pPr>
-        <w:pStyle w:val="LOnormal"/>
-        <w:jc w:val="center"/>
-        <w:rPr/>
-      </w:pPr>
-      <w:r>
-        <w:rPr/>
-      </w:r>
-    </w:p>
-    <w:p>
-      <w:pPr>
-        <w:pStyle w:val="LOnormal"/>
+        <w:pStyle w:val="LO-normal"/>
+        <w:jc w:val="center"/>
+        <w:rPr/>
+      </w:pPr>
+      <w:r>
+        <w:rPr/>
+      </w:r>
+    </w:p>
+    <w:p>
+      <w:pPr>
+        <w:pStyle w:val="LO-normal"/>
         <w:jc w:val="center"/>
         <w:rPr/>
       </w:pPr>
@@ -559,21 +590,20 @@
     </w:p>
     <w:p>
       <w:pPr>
-        <w:pStyle w:val="LOnormal"/>
-        <w:jc w:val="center"/>
-        <w:rPr/>
-      </w:pPr>
-      <w:r>
-        <w:rPr/>
-      </w:r>
-    </w:p>
-    <w:p>
-      <w:pPr>
-        <w:pStyle w:val="LOnormal"/>
+        <w:pStyle w:val="LO-normal"/>
+        <w:jc w:val="center"/>
+        <w:rPr/>
+      </w:pPr>
+      <w:r>
+        <w:rPr/>
+      </w:r>
+    </w:p>
+    <w:p>
+      <w:pPr>
+        <w:pStyle w:val="LO-normal"/>
         <w:spacing w:before="0" w:after="200"/>
         <w:jc w:val="center"/>
         <w:rPr>
-          <w:b/>
           <w:b/>
         </w:rPr>
       </w:pPr>
@@ -624,7 +654,7 @@
       <w:suppressAutoHyphens w:val="true"/>
       <w:bidi w:val="0"/>
       <w:spacing w:lineRule="auto" w:line="276" w:before="0" w:after="200"/>
-      <w:jc w:val="left"/>
+      <w:jc w:val="start"/>
     </w:pPr>
     <w:rPr>
       <w:rFonts w:ascii="Cambria" w:hAnsi="Cambria" w:eastAsia="Cambria" w:cs="Cambria"/>
@@ -635,10 +665,10 @@
       <w:lang w:val="en-US" w:eastAsia="zh-CN" w:bidi="hi-IN"/>
     </w:rPr>
   </w:style>
-  <w:style w:type="paragraph" w:styleId="Ttulo1">
-    <w:name w:val="Heading 1"/>
-    <w:basedOn w:val="LOnormal"/>
-    <w:next w:val="LOnormal"/>
+  <w:style w:type="paragraph" w:styleId="Heading1">
+    <w:name w:val="heading 1"/>
+    <w:basedOn w:val="LO-normal"/>
+    <w:next w:val="LO-normal"/>
     <w:qFormat/>
     <w:pPr>
       <w:keepNext w:val="true"/>
@@ -653,10 +683,10 @@
       <w:szCs w:val="28"/>
     </w:rPr>
   </w:style>
-  <w:style w:type="paragraph" w:styleId="Ttulo2">
-    <w:name w:val="Heading 2"/>
-    <w:basedOn w:val="LOnormal"/>
-    <w:next w:val="LOnormal"/>
+  <w:style w:type="paragraph" w:styleId="Heading2">
+    <w:name w:val="heading 2"/>
+    <w:basedOn w:val="LO-normal"/>
+    <w:next w:val="LO-normal"/>
     <w:qFormat/>
     <w:pPr>
       <w:keepNext w:val="true"/>
@@ -671,10 +701,10 @@
       <w:szCs w:val="26"/>
     </w:rPr>
   </w:style>
-  <w:style w:type="paragraph" w:styleId="Ttulo3">
-    <w:name w:val="Heading 3"/>
-    <w:basedOn w:val="LOnormal"/>
-    <w:next w:val="LOnormal"/>
+  <w:style w:type="paragraph" w:styleId="Heading3">
+    <w:name w:val="heading 3"/>
+    <w:basedOn w:val="LO-normal"/>
+    <w:next w:val="LO-normal"/>
     <w:qFormat/>
     <w:pPr>
       <w:keepNext w:val="true"/>
@@ -687,10 +717,10 @@
       <w:color w:val="4F81BD"/>
     </w:rPr>
   </w:style>
-  <w:style w:type="paragraph" w:styleId="Ttulo4">
-    <w:name w:val="Heading 4"/>
-    <w:basedOn w:val="LOnormal"/>
-    <w:next w:val="LOnormal"/>
+  <w:style w:type="paragraph" w:styleId="Heading4">
+    <w:name w:val="heading 4"/>
+    <w:basedOn w:val="LO-normal"/>
+    <w:next w:val="LO-normal"/>
     <w:qFormat/>
     <w:pPr>
       <w:keepNext w:val="true"/>
@@ -704,10 +734,10 @@
       <w:color w:val="4F81BD"/>
     </w:rPr>
   </w:style>
-  <w:style w:type="paragraph" w:styleId="Ttulo5">
-    <w:name w:val="Heading 5"/>
-    <w:basedOn w:val="LOnormal"/>
-    <w:next w:val="LOnormal"/>
+  <w:style w:type="paragraph" w:styleId="Heading5">
+    <w:name w:val="heading 5"/>
+    <w:basedOn w:val="LO-normal"/>
+    <w:next w:val="LO-normal"/>
     <w:qFormat/>
     <w:pPr>
       <w:keepNext w:val="true"/>
@@ -719,10 +749,10 @@
       <w:color w:val="243F61"/>
     </w:rPr>
   </w:style>
-  <w:style w:type="paragraph" w:styleId="Ttulo6">
-    <w:name w:val="Heading 6"/>
-    <w:basedOn w:val="LOnormal"/>
-    <w:next w:val="LOnormal"/>
+  <w:style w:type="paragraph" w:styleId="Heading6">
+    <w:name w:val="heading 6"/>
+    <w:basedOn w:val="LO-normal"/>
+    <w:next w:val="LO-normal"/>
     <w:qFormat/>
     <w:pPr>
       <w:keepNext w:val="true"/>
@@ -735,22 +765,22 @@
       <w:color w:val="243F61"/>
     </w:rPr>
   </w:style>
-  <w:style w:type="paragraph" w:styleId="Ttulo">
-    <w:name w:val="Título"/>
+  <w:style w:type="paragraph" w:styleId="Heading">
+    <w:name w:val="Heading"/>
     <w:basedOn w:val="Normal"/>
-    <w:next w:val="Cuerpodetexto"/>
+    <w:next w:val="BodyText"/>
     <w:qFormat/>
     <w:pPr>
       <w:keepNext w:val="true"/>
       <w:spacing w:before="240" w:after="120"/>
     </w:pPr>
     <w:rPr>
-      <w:rFonts w:ascii="Liberation Sans" w:hAnsi="Liberation Sans" w:eastAsia="Noto Sans CJK SC" w:cs="Lohit Devanagari"/>
+      <w:rFonts w:ascii="Liberation Sans" w:hAnsi="Liberation Sans" w:eastAsia="Arial Unicode MS" w:cs="Arial Unicode MS"/>
       <w:sz w:val="28"/>
       <w:szCs w:val="28"/>
     </w:rPr>
   </w:style>
-  <w:style w:type="paragraph" w:styleId="Cuerpodetexto">
+  <w:style w:type="paragraph" w:styleId="BodyText">
     <w:name w:val="Body Text"/>
     <w:basedOn w:val="Normal"/>
     <w:pPr>
@@ -758,16 +788,16 @@
     </w:pPr>
     <w:rPr/>
   </w:style>
-  <w:style w:type="paragraph" w:styleId="Lista">
+  <w:style w:type="paragraph" w:styleId="List">
     <w:name w:val="List"/>
-    <w:basedOn w:val="Cuerpodetexto"/>
+    <w:basedOn w:val="BodyText"/>
     <w:pPr/>
     <w:rPr>
       <w:rFonts w:cs="Lohit Devanagari"/>
     </w:rPr>
   </w:style>
-  <w:style w:type="paragraph" w:styleId="Leyenda">
-    <w:name w:val="Caption"/>
+  <w:style w:type="paragraph" w:styleId="Caption">
+    <w:name w:val="caption"/>
     <w:basedOn w:val="Normal"/>
     <w:qFormat/>
     <w:pPr>
@@ -782,7 +812,33 @@
       <w:szCs w:val="24"/>
     </w:rPr>
   </w:style>
-  <w:style w:type="paragraph" w:styleId="Ndice">
+  <w:style w:type="paragraph" w:styleId="Index">
+    <w:name w:val="Index"/>
+    <w:basedOn w:val="Normal"/>
+    <w:qFormat/>
+    <w:pPr>
+      <w:suppressLineNumbers/>
+    </w:pPr>
+    <w:rPr>
+      <w:rFonts w:cs="Arial Unicode MS"/>
+    </w:rPr>
+  </w:style>
+  <w:style w:type="paragraph" w:styleId="Ttulo">
+    <w:name w:val="Título"/>
+    <w:basedOn w:val="Normal"/>
+    <w:next w:val="BodyText"/>
+    <w:qFormat/>
+    <w:pPr>
+      <w:keepNext w:val="true"/>
+      <w:spacing w:before="240" w:after="120"/>
+    </w:pPr>
+    <w:rPr>
+      <w:rFonts w:ascii="Liberation Sans" w:hAnsi="Liberation Sans" w:eastAsia="Noto Sans CJK SC" w:cs="Lohit Devanagari"/>
+      <w:sz w:val="28"/>
+      <w:szCs w:val="28"/>
+    </w:rPr>
+  </w:style>
+  <w:style w:type="paragraph" w:styleId="ndice">
     <w:name w:val="Índice"/>
     <w:basedOn w:val="Normal"/>
     <w:qFormat/>
@@ -793,7 +849,7 @@
       <w:rFonts w:cs="Lohit Devanagari"/>
     </w:rPr>
   </w:style>
-  <w:style w:type="paragraph" w:styleId="LOnormal" w:default="1">
+  <w:style w:type="paragraph" w:styleId="LO-normal" w:default="1">
     <w:name w:val="LO-normal"/>
     <w:qFormat/>
     <w:pPr>
@@ -801,7 +857,7 @@
       <w:suppressAutoHyphens w:val="true"/>
       <w:bidi w:val="0"/>
       <w:spacing w:lineRule="auto" w:line="276" w:before="0" w:after="200"/>
-      <w:jc w:val="left"/>
+      <w:jc w:val="start"/>
     </w:pPr>
     <w:rPr>
       <w:rFonts w:ascii="Cambria" w:hAnsi="Cambria" w:eastAsia="Cambria" w:cs="Cambria"/>
@@ -812,10 +868,10 @@
       <w:lang w:val="en-US" w:eastAsia="zh-CN" w:bidi="hi-IN"/>
     </w:rPr>
   </w:style>
-  <w:style w:type="paragraph" w:styleId="Ttulogeneral">
+  <w:style w:type="paragraph" w:styleId="Title">
     <w:name w:val="Title"/>
-    <w:basedOn w:val="LOnormal"/>
-    <w:next w:val="LOnormal"/>
+    <w:basedOn w:val="LO-normal"/>
+    <w:next w:val="LO-normal"/>
     <w:qFormat/>
     <w:pPr>
       <w:pBdr>
@@ -830,10 +886,10 @@
       <w:szCs w:val="52"/>
     </w:rPr>
   </w:style>
-  <w:style w:type="paragraph" w:styleId="Subttulo">
+  <w:style w:type="paragraph" w:styleId="Subtitle">
     <w:name w:val="Subtitle"/>
-    <w:basedOn w:val="LOnormal"/>
-    <w:next w:val="LOnormal"/>
+    <w:basedOn w:val="LO-normal"/>
+    <w:next w:val="LO-normal"/>
     <w:qFormat/>
     <w:pPr/>
     <w:rPr>
@@ -851,14 +907,14 @@
 </file>
 
 <file path=word/theme/theme1.xml><?xml version="1.0" encoding="utf-8"?>
-<a:theme xmlns:a="http://schemas.openxmlformats.org/drawingml/2006/main" name="Office Theme">
+<a:theme xmlns:a="http://schemas.openxmlformats.org/drawingml/2006/main" xmlns:r="http://schemas.openxmlformats.org/officeDocument/2006/relationships" name="Office Theme">
   <a:themeElements>
     <a:clrScheme name="Office">
       <a:dk1>
-        <a:sysClr val="windowText" lastClr="000000"/>
+        <a:srgbClr val="000000"/>
       </a:dk1>
       <a:lt1>
-        <a:sysClr val="window" lastClr="FFFFFF"/>
+        <a:srgbClr val="FFFFFF"/>
       </a:lt1>
       <a:dk2>
         <a:srgbClr val="1F497D"/>
@@ -893,279 +949,131 @@
     </a:clrScheme>
     <a:fontScheme name="Office">
       <a:majorFont>
-        <a:latin typeface="Calibri"/>
+        <a:latin typeface="Calibri" pitchFamily="0" charset="1"/>
         <a:ea typeface=""/>
         <a:cs typeface=""/>
-        <a:font script="Jpan" typeface="ＭＳ ゴシック"/>
-        <a:font script="Hang" typeface="맑은 고딕"/>
-        <a:font script="Hans" typeface="宋体"/>
-        <a:font script="Hant" typeface="新細明體"/>
-        <a:font script="Arab" typeface="Times New Roman"/>
-        <a:font script="Hebr" typeface="Times New Roman"/>
-        <a:font script="Thai" typeface="Angsana New"/>
-        <a:font script="Ethi" typeface="Nyala"/>
-        <a:font script="Beng" typeface="Vrinda"/>
-        <a:font script="Gujr" typeface="Shruti"/>
-        <a:font script="Khmr" typeface="MoolBoran"/>
-        <a:font script="Knda" typeface="Tunga"/>
-        <a:font script="Guru" typeface="Raavi"/>
-        <a:font script="Cans" typeface="Euphemia"/>
-        <a:font script="Cher" typeface="Plantagenet Cherokee"/>
-        <a:font script="Yiii" typeface="Microsoft Yi Baiti"/>
-        <a:font script="Tibt" typeface="Microsoft Himalaya"/>
-        <a:font script="Thaa" typeface="MV Boli"/>
-        <a:font script="Deva" typeface="Mangal"/>
-        <a:font script="Telu" typeface="Gautami"/>
-        <a:font script="Taml" typeface="Latha"/>
-        <a:font script="Syrc" typeface="Estrangelo Edessa"/>
-        <a:font script="Orya" typeface="Kalinga"/>
-        <a:font script="Mlym" typeface="Kartika"/>
-        <a:font script="Laoo" typeface="DokChampa"/>
-        <a:font script="Sinh" typeface="Iskoola Pota"/>
-        <a:font script="Mong" typeface="Mongolian Baiti"/>
-        <a:font script="Viet" typeface="Times New Roman"/>
-        <a:font script="Uigh" typeface="Microsoft Uighur"/>
-        <a:font script="Geor" typeface="Sylfaen"/>
       </a:majorFont>
       <a:minorFont>
-        <a:latin typeface="Cambria"/>
+        <a:latin typeface="Cambria" pitchFamily="0" charset="1"/>
         <a:ea typeface=""/>
         <a:cs typeface=""/>
-        <a:font script="Jpan" typeface="ＭＳ 明朝"/>
-        <a:font script="Hang" typeface="맑은 고딕"/>
-        <a:font script="Hans" typeface="宋体"/>
-        <a:font script="Hant" typeface="新細明體"/>
-        <a:font script="Arab" typeface="Arial"/>
-        <a:font script="Hebr" typeface="Arial"/>
-        <a:font script="Thai" typeface="Cordia New"/>
-        <a:font script="Ethi" typeface="Nyala"/>
-        <a:font script="Beng" typeface="Vrinda"/>
-        <a:font script="Gujr" typeface="Shruti"/>
-        <a:font script="Khmr" typeface="DaunPenh"/>
-        <a:font script="Knda" typeface="Tunga"/>
-        <a:font script="Guru" typeface="Raavi"/>
-        <a:font script="Cans" typeface="Euphemia"/>
-        <a:font script="Cher" typeface="Plantagenet Cherokee"/>
-        <a:font script="Yiii" typeface="Microsoft Yi Baiti"/>
-        <a:font script="Tibt" typeface="Microsoft Himalaya"/>
-        <a:font script="Thaa" typeface="MV Boli"/>
-        <a:font script="Deva" typeface="Mangal"/>
-        <a:font script="Telu" typeface="Gautami"/>
-        <a:font script="Taml" typeface="Latha"/>
-        <a:font script="Syrc" typeface="Estrangelo Edessa"/>
-        <a:font script="Orya" typeface="Kalinga"/>
-        <a:font script="Mlym" typeface="Kartika"/>
-        <a:font script="Laoo" typeface="DokChampa"/>
-        <a:font script="Sinh" typeface="Iskoola Pota"/>
-        <a:font script="Mong" typeface="Mongolian Baiti"/>
-        <a:font script="Viet" typeface="Arial"/>
-        <a:font script="Uigh" typeface="Microsoft Uighur"/>
-        <a:font script="Geor" typeface="Sylfaen"/>
       </a:minorFont>
     </a:fontScheme>
-    <a:fmtScheme name="Office">
+    <a:fmtScheme>
       <a:fillStyleLst>
         <a:solidFill>
           <a:schemeClr val="phClr"/>
         </a:solidFill>
-        <a:gradFill rotWithShape="1">
+        <a:gradFill>
           <a:gsLst>
             <a:gs pos="0">
               <a:schemeClr val="phClr">
                 <a:tint val="50000"/>
-                <a:satMod val="300000"/>
               </a:schemeClr>
             </a:gs>
             <a:gs pos="35000">
               <a:schemeClr val="phClr">
                 <a:tint val="37000"/>
-                <a:satMod val="300000"/>
               </a:schemeClr>
             </a:gs>
             <a:gs pos="100000">
               <a:schemeClr val="phClr">
                 <a:tint val="15000"/>
-                <a:satMod val="350000"/>
               </a:schemeClr>
             </a:gs>
           </a:gsLst>
           <a:lin ang="16200000" scaled="1"/>
+          <a:tileRect l="0" t="0" r="0" b="0"/>
         </a:gradFill>
-        <a:gradFill rotWithShape="1">
+        <a:gradFill>
           <a:gsLst>
             <a:gs pos="0">
               <a:schemeClr val="phClr">
                 <a:tint val="100000"/>
                 <a:shade val="100000"/>
-                <a:satMod val="130000"/>
               </a:schemeClr>
             </a:gs>
             <a:gs pos="100000">
               <a:schemeClr val="phClr">
                 <a:tint val="50000"/>
                 <a:shade val="100000"/>
-                <a:satMod val="350000"/>
               </a:schemeClr>
             </a:gs>
           </a:gsLst>
           <a:lin ang="16200000" scaled="0"/>
+          <a:tileRect l="0" t="0" r="0" b="0"/>
         </a:gradFill>
       </a:fillStyleLst>
       <a:lnStyleLst>
         <a:ln w="9525" cap="flat" cmpd="sng" algn="ctr">
-          <a:solidFill>
-            <a:schemeClr val="phClr">
-              <a:shade val="95000"/>
-              <a:satMod val="105000"/>
-            </a:schemeClr>
-          </a:solidFill>
           <a:prstDash val="solid"/>
         </a:ln>
         <a:ln w="25400" cap="flat" cmpd="sng" algn="ctr">
-          <a:solidFill>
-            <a:schemeClr val="phClr"/>
-          </a:solidFill>
           <a:prstDash val="solid"/>
         </a:ln>
         <a:ln w="38100" cap="flat" cmpd="sng" algn="ctr">
-          <a:solidFill>
-            <a:schemeClr val="phClr"/>
-          </a:solidFill>
           <a:prstDash val="solid"/>
         </a:ln>
       </a:lnStyleLst>
       <a:effectStyleLst>
         <a:effectStyle>
-          <a:effectLst>
-            <a:outerShdw blurRad="40000" dist="20000" dir="5400000" rotWithShape="0">
-              <a:srgbClr val="000000">
-                <a:alpha val="38000"/>
-              </a:srgbClr>
-            </a:outerShdw>
-          </a:effectLst>
+          <a:effectLst/>
         </a:effectStyle>
         <a:effectStyle>
-          <a:effectLst>
-            <a:outerShdw blurRad="40000" dist="23000" dir="5400000" rotWithShape="0">
-              <a:srgbClr val="000000">
-                <a:alpha val="35000"/>
-              </a:srgbClr>
-            </a:outerShdw>
-          </a:effectLst>
+          <a:effectLst/>
         </a:effectStyle>
         <a:effectStyle>
-          <a:effectLst>
-            <a:outerShdw blurRad="40000" dist="23000" dir="5400000" rotWithShape="0">
-              <a:srgbClr val="000000">
-                <a:alpha val="35000"/>
-              </a:srgbClr>
-            </a:outerShdw>
-          </a:effectLst>
-          <a:scene3d>
-            <a:camera prst="orthographicFront">
-              <a:rot lat="0" lon="0" rev="0"/>
-            </a:camera>
-            <a:lightRig rig="threePt" dir="t">
-              <a:rot lat="0" lon="0" rev="1200000"/>
-            </a:lightRig>
-          </a:scene3d>
-          <a:sp3d>
-            <a:bevelT w="63500" h="25400"/>
-          </a:sp3d>
+          <a:effectLst/>
         </a:effectStyle>
       </a:effectStyleLst>
       <a:bgFillStyleLst>
         <a:solidFill>
           <a:schemeClr val="phClr"/>
         </a:solidFill>
-        <a:gradFill rotWithShape="1">
+        <a:gradFill>
           <a:gsLst>
             <a:gs pos="0">
               <a:schemeClr val="phClr">
                 <a:tint val="40000"/>
-                <a:satMod val="350000"/>
               </a:schemeClr>
             </a:gs>
             <a:gs pos="40000">
               <a:schemeClr val="phClr">
                 <a:tint val="45000"/>
                 <a:shade val="99000"/>
-                <a:satMod val="350000"/>
               </a:schemeClr>
             </a:gs>
             <a:gs pos="100000">
               <a:schemeClr val="phClr">
                 <a:shade val="20000"/>
-                <a:satMod val="255000"/>
               </a:schemeClr>
             </a:gs>
           </a:gsLst>
           <a:path path="circle">
             <a:fillToRect l="50000" t="-80000" r="50000" b="180000"/>
           </a:path>
+          <a:tileRect l="0" t="0" r="0" b="0"/>
         </a:gradFill>
-        <a:gradFill rotWithShape="1">
+        <a:gradFill>
           <a:gsLst>
             <a:gs pos="0">
               <a:schemeClr val="phClr">
                 <a:tint val="80000"/>
-                <a:satMod val="300000"/>
               </a:schemeClr>
             </a:gs>
             <a:gs pos="100000">
               <a:schemeClr val="phClr">
                 <a:shade val="30000"/>
-                <a:satMod val="200000"/>
               </a:schemeClr>
             </a:gs>
           </a:gsLst>
           <a:path path="circle">
             <a:fillToRect l="50000" t="50000" r="50000" b="50000"/>
           </a:path>
+          <a:tileRect l="0" t="0" r="0" b="0"/>
         </a:gradFill>
       </a:bgFillStyleLst>
     </a:fmtScheme>
   </a:themeElements>
-  <a:objectDefaults>
-    <a:spDef>
-      <a:spPr/>
-      <a:bodyPr/>
-      <a:lstStyle/>
-      <a:style>
-        <a:lnRef idx="1">
-          <a:schemeClr val="accent1"/>
-        </a:lnRef>
-        <a:fillRef idx="3">
-          <a:schemeClr val="accent1"/>
-        </a:fillRef>
-        <a:effectRef idx="2">
-          <a:schemeClr val="accent1"/>
-        </a:effectRef>
-        <a:fontRef idx="minor">
-          <a:schemeClr val="lt1"/>
-        </a:fontRef>
-      </a:style>
-    </a:spDef>
-    <a:lnDef>
-      <a:spPr/>
-      <a:bodyPr/>
-      <a:lstStyle/>
-      <a:style>
-        <a:lnRef idx="2">
-          <a:schemeClr val="accent1"/>
-        </a:lnRef>
-        <a:fillRef idx="0">
-          <a:schemeClr val="accent1"/>
-        </a:fillRef>
-        <a:effectRef idx="1">
-          <a:schemeClr val="accent1"/>
-        </a:effectRef>
-        <a:fontRef idx="minor">
-          <a:schemeClr val="tx1"/>
-        </a:fontRef>
-      </a:style>
-    </a:lnDef>
-  </a:objectDefaults>
-  <a:extraClrSchemeLst/>
 </a:theme>
 </file>
</xml_diff>

<commit_message>
fix(plantillas): reemplazar bloque de firmas por tabla en vez de columnas
- Bloque de firmas (contrato y ambos pagares) rediseñado como tabla sin bordes
  con cantSplit, en lugar de seccion de 2 columnas + salto manual + keepNext
- El diseño anterior se cortaba entre paginas de forma inconsistente segun
  version de LibreOffice (probado en 24.2.7.2 vs 26.2.4.2)
- Tablas tienen comportamiento mucho mas estable entre versiones para
  mantener contenido unido, relevante de cara a la reventa multiplataforma
- Versiones anteriores conservadas en plantillas/obsoletas/
</commit_message>
<xml_diff>
--- a/plantillas/plantilla_contrato_mutuo.docx
+++ b/plantillas/plantilla_contrato_mutuo.docx
@@ -450,180 +450,177 @@
           <w:type w:val="nextPage"/>
           <w:pgSz w:w="11906" w:h="16838"/>
           <w:pgMar w:left="1133" w:right="850" w:gutter="0" w:header="0" w:top="1440" w:footer="0" w:bottom="1440"/>
-          <w:pgNumType w:start="1" w:fmt="decimal"/>
+          <w:pgNumType w:fmt="decimal"/>
           <w:formProt w:val="false"/>
           <w:textDirection w:val="lrTb"/>
-          <w:docGrid w:type="default" w:linePitch="100" w:charSpace="4096"/>
+          <w:docGrid w:type="default" w:linePitch="600" w:charSpace="36864"/>
         </w:sectPr>
       </w:pPr>
     </w:p>
-    <w:p>
-      <w:pPr>
-        <w:pStyle w:val="LO-normal"/>
-        <w:spacing w:lineRule="auto" w:line="240"/>
-        <w:jc w:val="center"/>
-        <w:rPr/>
-      </w:pPr>
-      <w:r>
-        <w:rPr/>
-      </w:r>
-    </w:p>
-    <w:p>
-      <w:pPr>
-        <w:pStyle w:val="LO-normal"/>
-        <w:spacing w:lineRule="auto" w:line="240"/>
-        <w:jc w:val="center"/>
-        <w:rPr/>
-      </w:pPr>
-      <w:r>
-        <w:rPr/>
-        <w:t xml:space="preserve"> </w:t>
-      </w:r>
-      <w:r>
-        <w:rPr/>
-        <w:t>-----------------------------</w:t>
-        <w:br/>
-        <w:t>Firma</w:t>
-      </w:r>
-    </w:p>
-    <w:p>
-      <w:pPr>
-        <w:pStyle w:val="LO-normal"/>
-        <w:jc w:val="center"/>
-        <w:rPr/>
-      </w:pPr>
-      <w:r>
-        <w:rPr/>
-      </w:r>
-    </w:p>
-    <w:p>
-      <w:pPr>
-        <w:pStyle w:val="LO-normal"/>
-        <w:jc w:val="center"/>
-        <w:rPr/>
-      </w:pPr>
-      <w:r>
-        <w:rPr/>
-        <w:t>-----------------------------</w:t>
-        <w:br/>
-        <w:t>Aclaración</w:t>
-      </w:r>
-    </w:p>
-    <w:p>
-      <w:pPr>
-        <w:pStyle w:val="LO-normal"/>
-        <w:jc w:val="center"/>
-        <w:rPr/>
-      </w:pPr>
-      <w:r>
-        <w:rPr/>
-      </w:r>
-    </w:p>
-    <w:p>
-      <w:pPr>
-        <w:pStyle w:val="LO-normal"/>
-        <w:jc w:val="center"/>
-        <w:rPr/>
-      </w:pPr>
-      <w:r>
-        <w:rPr>
-          <w:b/>
-        </w:rPr>
-        <w:t>{{cliente_nro_doc}}</w:t>
-        <w:br/>
-        <w:t>{{cliente_tipo_doc}}</w:t>
-      </w:r>
-    </w:p>
-    <w:p>
-      <w:pPr>
-        <w:pStyle w:val="LO-normal"/>
-        <w:spacing w:before="0" w:after="200"/>
-        <w:jc w:val="center"/>
-        <w:rPr/>
-      </w:pPr>
-      <w:r>
-        <w:br w:type="column"/>
-      </w:r>
-      <w:r>
-        <w:rPr/>
-      </w:r>
-    </w:p>
-    <w:p>
-      <w:pPr>
-        <w:pStyle w:val="LO-normal"/>
-        <w:jc w:val="center"/>
-        <w:rPr/>
-      </w:pPr>
-      <w:r>
-        <w:rPr/>
-        <w:t xml:space="preserve"> </w:t>
-      </w:r>
-      <w:r>
-        <w:rPr/>
-        <w:t>-----------------------------</w:t>
-        <w:br/>
-        <w:t>Firma</w:t>
-      </w:r>
-    </w:p>
-    <w:p>
-      <w:pPr>
-        <w:pStyle w:val="LO-normal"/>
-        <w:jc w:val="center"/>
-        <w:rPr/>
-      </w:pPr>
-      <w:r>
-        <w:rPr/>
-      </w:r>
-    </w:p>
-    <w:p>
-      <w:pPr>
-        <w:pStyle w:val="LO-normal"/>
-        <w:jc w:val="center"/>
-        <w:rPr/>
-      </w:pPr>
-      <w:r>
-        <w:rPr/>
-        <w:t>-----------------------------</w:t>
-        <w:br/>
-        <w:t>Aclaración</w:t>
-      </w:r>
-    </w:p>
-    <w:p>
-      <w:pPr>
-        <w:pStyle w:val="LO-normal"/>
-        <w:jc w:val="center"/>
-        <w:rPr/>
-      </w:pPr>
-      <w:r>
-        <w:rPr/>
-      </w:r>
-    </w:p>
-    <w:p>
-      <w:pPr>
-        <w:pStyle w:val="LO-normal"/>
-        <w:spacing w:before="0" w:after="200"/>
-        <w:jc w:val="center"/>
-        <w:rPr>
-          <w:b/>
-        </w:rPr>
-      </w:pPr>
-      <w:r>
-        <w:rPr>
-          <w:b/>
-        </w:rPr>
-        <w:t>{{garante_nro_doc}}</w:t>
-        <w:br/>
-        <w:t>{{garante_tipo_doc}}</w:t>
-      </w:r>
-    </w:p>
+    <w:tbl>
+      <w:tblPr>
+        <w:tblW w:type="auto" w:w="0"/>
+        <w:tblLayout w:type="autofit"/>
+        <w:tblLook w:firstColumn="1" w:firstRow="1" w:lastColumn="0" w:lastRow="0" w:noHBand="0" w:noVBand="1" w:val="04A0"/>
+        <w:tblBorders>
+          <w:top w:val="none" w:sz="0" w:space="0" w:color="auto"/>
+          <w:left w:val="none" w:sz="0" w:space="0" w:color="auto"/>
+          <w:bottom w:val="none" w:sz="0" w:space="0" w:color="auto"/>
+          <w:right w:val="none" w:sz="0" w:space="0" w:color="auto"/>
+          <w:insideH w:val="none" w:sz="0" w:space="0" w:color="auto"/>
+          <w:insideV w:val="none" w:sz="0" w:space="0" w:color="auto"/>
+        </w:tblBorders>
+      </w:tblPr>
+      <w:tblGrid>
+        <w:gridCol w:w="4961"/>
+        <w:gridCol w:w="4961"/>
+      </w:tblGrid>
+      <w:tr>
+        <w:trPr>
+          <w:cantSplit w:val="true"/>
+        </w:trPr>
+        <w:tc>
+          <w:tcPr>
+            <w:tcW w:type="dxa" w:w="4961"/>
+          </w:tcPr>
+          <w:p>
+            <w:pPr>
+              <w:jc w:val="center"/>
+            </w:pPr>
+            <w:r/>
+            <w:r/>
+          </w:p>
+          <w:p>
+            <w:pPr>
+              <w:jc w:val="center"/>
+            </w:pPr>
+            <w:r>
+              <w:t>-----------------------------</w:t>
+            </w:r>
+            <w:r>
+              <w:br/>
+            </w:r>
+            <w:r>
+              <w:t>Firma</w:t>
+            </w:r>
+          </w:p>
+          <w:p>
+            <w:pPr>
+              <w:jc w:val="center"/>
+            </w:pPr>
+            <w:r/>
+          </w:p>
+          <w:p>
+            <w:pPr>
+              <w:jc w:val="center"/>
+            </w:pPr>
+            <w:r>
+              <w:t>-----------------------------</w:t>
+            </w:r>
+            <w:r>
+              <w:br/>
+            </w:r>
+            <w:r>
+              <w:t>Aclaración</w:t>
+            </w:r>
+          </w:p>
+          <w:p>
+            <w:pPr>
+              <w:jc w:val="center"/>
+            </w:pPr>
+            <w:r/>
+          </w:p>
+          <w:p>
+            <w:pPr>
+              <w:jc w:val="center"/>
+            </w:pPr>
+            <w:r>
+              <w:t>{{cliente_nro_doc}}</w:t>
+            </w:r>
+            <w:r>
+              <w:br/>
+            </w:r>
+            <w:r>
+              <w:t>{{cliente_tipo_doc}}</w:t>
+            </w:r>
+          </w:p>
+        </w:tc>
+        <w:tc>
+          <w:tcPr>
+            <w:tcW w:type="dxa" w:w="4961"/>
+          </w:tcPr>
+          <w:p>
+            <w:pPr>
+              <w:jc w:val="center"/>
+            </w:pPr>
+            <w:r/>
+            <w:r/>
+          </w:p>
+          <w:p>
+            <w:pPr>
+              <w:jc w:val="center"/>
+            </w:pPr>
+            <w:r>
+              <w:t>-----------------------------</w:t>
+            </w:r>
+            <w:r>
+              <w:br/>
+            </w:r>
+            <w:r>
+              <w:t>Firma</w:t>
+            </w:r>
+          </w:p>
+          <w:p>
+            <w:pPr>
+              <w:jc w:val="center"/>
+            </w:pPr>
+            <w:r/>
+          </w:p>
+          <w:p>
+            <w:pPr>
+              <w:jc w:val="center"/>
+            </w:pPr>
+            <w:r>
+              <w:t>-----------------------------</w:t>
+            </w:r>
+            <w:r>
+              <w:br/>
+            </w:r>
+            <w:r>
+              <w:t>Aclaración</w:t>
+            </w:r>
+          </w:p>
+          <w:p>
+            <w:pPr>
+              <w:jc w:val="center"/>
+            </w:pPr>
+            <w:r/>
+          </w:p>
+          <w:p>
+            <w:pPr>
+              <w:jc w:val="center"/>
+            </w:pPr>
+            <w:r>
+              <w:t>{{garante_nro_doc}}</w:t>
+            </w:r>
+            <w:r>
+              <w:br/>
+            </w:r>
+            <w:r>
+              <w:t>{{garante_tipo_doc}}</w:t>
+            </w:r>
+          </w:p>
+        </w:tc>
+      </w:tr>
+    </w:tbl>
     <w:sectPr>
       <w:type w:val="continuous"/>
       <w:pgSz w:w="11906" w:h="16838"/>
       <w:pgMar w:left="1133" w:right="850" w:gutter="0" w:header="0" w:top="1440" w:footer="0" w:bottom="1440"/>
-      <w:cols w:num="2" w:space="720" w:equalWidth="true" w:sep="false"/>
+      <w:cols w:num="1" w:space="720" w:equalWidth="true" w:sep="false"/>
       <w:formProt w:val="false"/>
       <w:textDirection w:val="lrTb"/>
-      <w:docGrid w:type="default" w:linePitch="100" w:charSpace="4096"/>
+      <w:docGrid w:type="default" w:linePitch="600" w:charSpace="36864"/>
     </w:sectPr>
   </w:body>
 </w:document>

</xml_diff>